<commit_message>
Add Groq-powered AI gym/PT recommend chat with widget and docs.
Wire /api/ai/recommend, session history, homepage widget, and update specs/QA while keeping local API keys and report templates out of the repo.

Co-authored-by: Cursor <cursoragent@cursor.com>
</commit_message>
<xml_diff>
--- a/docs/specs/GYMFINDER_CSDL.docx
+++ b/docs/specs/GYMFINDER_CSDL.docx
@@ -69,7 +69,7 @@
         <w:rPr>
           <w:szCs w:val="26"/>
         </w:rPr>
-        <w:t>CSDL được thiết kế theo mô hình cơ sở dữ liệu quan hệ (RDBMS), đạt Chuẩn hóa bậc 3 (3NF) nhằm loại bỏ hoàn toàn dư thừa dữ liệu và đảm bảo tính toàn vẹn tham chiếu. Hệ thống gồm 15 bảng liên kết chặt chẽ:</w:t>
+        <w:t>CSDL được thiết kế theo mô hình cơ sở dữ liệu quan hệ (RDBMS), đạt Chuẩn hóa bậc 3 (3NF) nhằm loại bỏ hoàn toàn dư thừa dữ liệu và đảm bảo tính toàn vẹn tham chiếu. Hệ thống gồm 15 bảng dữ liệu chính, chia thành bốn nhóm chức năng. Module Trợ lý AI (gợi ý phòng tập / PT) không yêu cầu bảng lưu trữ bắt buộc trong phiên bản hiện tại: dữ liệu nền tảng vẫn lấy từ các bảng gyms, trainers và danh mục liên quan; lịch sử hội thoại ngắn được giữ trong phiên làm việc (PHP session), không ghi vào CSDL.</w:t>
       </w:r>
     </w:p>
     <w:p>
@@ -138,6 +138,18 @@
     </w:p>
     <w:p>
       <w:pPr>
+        <w:spacing w:after="60"/>
+        <w:rPr>
+          <w:color w:val="000000" w:themeColor="text1"/>
+          <w:szCs w:val="26"/>
+        </w:rPr>
+      </w:pPr>
+      <w:r>
+        <w:t>Ghi chú Trợ lý AI (ứng dụng): API POST /api/ai/recommend và trang /ai/chat đọc catalog từ CSDL (chỉ bản ghi status=active của gyms/trainers; kèm districts, categories, specialties, amenities). Lịch sử chat tối đa 12 lượt được lưu tạm trong session và xóa khi đăng xuất. Hướng mở rộng (không bắt buộc MVP): có thể bổ sung bảng ai_conversations / ai_messages nếu cần lưu vĩnh viễn hội thoại theo user_id.</w:t>
+      </w:r>
+    </w:p>
+    <w:p>
+      <w:pPr>
         <w:keepNext/>
         <w:spacing w:before="280" w:after="120"/>
         <w:rPr>
@@ -1482,6 +1494,111 @@
                 <w:szCs w:val="26"/>
               </w:rPr>
               <w:t>Chính sách nghiệp vụ ưu tiên Tạm ẩn (status='hidden') thay vì Xóa vật lý (Hard Delete) đối với gyms và trainers. Do reviews có khóa ngoại ON DELETE CASCADE tới trainers và gyms, nếu xóa cứng đối tượng thì toàn bộ đánh giá lịch sử (kể cả đã approved) sẽ bị xóa sạch theo cascade, gây mất dữ liệu lịch sử và sai lệch thống kê rating. Vì vậy giao diện quản trị không cung cấp nút Xóa cứng cho phòng tập và HLV; Admin chỉ tạm ẩn hoặc kích hoạt lại. Cơ chế status = 'hidden' cho phép ngừng công khai trên toàn bộ giao diện người dùng (danh sách, tìm kiếm, trang chủ, yêu thích và chặn truy cập URL chi tiết trả về 404), trong khi vẫn bảo toàn 100% dữ liệu lịch sử đánh giá và quan hệ phụ thuộc. Khóa tài khoản User (status = 'locked') ngăn chặn đăng nhập và gửi đánh giá mới nhưng bảo toàn dữ liệu đánh giá mà User đó đã gửi trước đây. Ràng buộc ON DELETE ở tầng CSDL vẫn được giữ để bảo vệ toàn vẹn tham chiếu nếu có thao tác dọn dữ liệu có kiểm soát ngoài giao diện thông thường.</w:t>
+            </w:r>
+          </w:p>
+        </w:tc>
+      </w:tr>
+      <w:tr>
+        <w:trPr>
+          <w:jc w:val="center"/>
+        </w:trPr>
+        <w:tc>
+          <w:tcPr>
+            <w:tcW w:w="2160" w:type="dxa"/>
+          </w:tcPr>
+          <w:p>
+            <w:pPr>
+              <w:rPr>
+                <w:color w:val="000000" w:themeColor="text1"/>
+                <w:szCs w:val="26"/>
+              </w:rPr>
+            </w:pPr>
+            <w:proofErr w:type="spellStart"/>
+            <w:r>
+              <w:rPr>
+                <w:szCs w:val="26"/>
+              </w:rPr>
+              <w:t>Trợ lý AI gợi ý Gym/PT (không lưu hội thoại bắt buộc)</w:t>
+            </w:r>
+            <w:proofErr w:type="spellEnd"/>
+            <w:r>
+              <w:rPr>
+                <w:szCs w:val="26"/>
+              </w:rPr>
+            </w:r>
+            <w:proofErr w:type="spellStart"/>
+            <w:r>
+              <w:rPr>
+                <w:szCs w:val="26"/>
+              </w:rPr>
+            </w:r>
+            <w:proofErr w:type="spellEnd"/>
+            <w:r>
+              <w:rPr>
+                <w:szCs w:val="26"/>
+              </w:rPr>
+            </w:r>
+            <w:proofErr w:type="spellStart"/>
+            <w:r>
+              <w:rPr>
+                <w:szCs w:val="26"/>
+              </w:rPr>
+            </w:r>
+            <w:proofErr w:type="spellEnd"/>
+            <w:r>
+              <w:rPr>
+                <w:szCs w:val="26"/>
+              </w:rPr>
+            </w:r>
+            <w:proofErr w:type="spellStart"/>
+            <w:r>
+              <w:rPr>
+                <w:szCs w:val="26"/>
+              </w:rPr>
+            </w:r>
+            <w:proofErr w:type="spellEnd"/>
+            <w:r>
+              <w:rPr>
+                <w:szCs w:val="26"/>
+              </w:rPr>
+            </w:r>
+          </w:p>
+        </w:tc>
+        <w:tc>
+          <w:tcPr>
+            <w:tcW w:w="2880" w:type="dxa"/>
+          </w:tcPr>
+          <w:p>
+            <w:pPr>
+              <w:rPr>
+                <w:color w:val="000000" w:themeColor="text1"/>
+                <w:szCs w:val="26"/>
+              </w:rPr>
+            </w:pPr>
+            <w:r>
+              <w:rPr>
+                <w:szCs w:val="26"/>
+              </w:rPr>
+              <w:t>Không thêm bảng CSDL bắt buộc cho MVP. Catalog gợi ý lấy từ gyms, trainers và các bảng danh mục đã chuẩn hóa; lịch sử hội thoại ngắn (≤12 lượt) lưu trong PHP session, xóa khi logout.</w:t>
+            </w:r>
+          </w:p>
+        </w:tc>
+        <w:tc>
+          <w:tcPr>
+            <w:tcW w:w="4896" w:type="dxa"/>
+          </w:tcPr>
+          <w:p>
+            <w:pPr>
+              <w:rPr>
+                <w:color w:val="000000" w:themeColor="text1"/>
+                <w:szCs w:val="26"/>
+              </w:rPr>
+            </w:pPr>
+            <w:r>
+              <w:rPr>
+                <w:szCs w:val="26"/>
+              </w:rPr>
+              <w:t>Tái sử dụng dữ liệu đã chuẩn hóa 3NF; tránh dư thừa và chi phí đồng bộ. Session đủ cho MVP; bảng ai_* chỉ cần khi yêu cầu audit/lưu lịch sử dài hạn.</w:t>
             </w:r>
           </w:p>
         </w:tc>
@@ -16678,24 +16795,6 @@
     </w:p>
     <w:p>
       <w:pPr>
-        <w:keepNext/>
-        <w:spacing w:before="280" w:after="120"/>
-        <w:rPr>
-          <w:color w:val="000000" w:themeColor="text1"/>
-          <w:szCs w:val="26"/>
-        </w:rPr>
-      </w:pPr>
-      <w:r>
-        <w:rPr>
-          <w:b/>
-          <w:szCs w:val="26"/>
-        </w:rPr>
-        <w:lastRenderedPageBreak/>
-        <w:t>5. Ràng buộc toàn vẹn &amp; Quy tắc nghiệp vụ (Integrity Constraints)</w:t>
-      </w:r>
-    </w:p>
-    <w:p>
-      <w:pPr>
         <w:pStyle w:val="ListBullet"/>
         <w:spacing w:after="60"/>
         <w:rPr>
@@ -16708,6 +16807,18 @@
           <w:szCs w:val="26"/>
         </w:rPr>
         <w:t>4.13. Bảng password_reset_otps (OTP quên mật khẩu qua email)</w:t>
+      </w:r>
+      <w:proofErr w:type="gramStart"/>
+      <w:r>
+        <w:rPr>
+          <w:szCs w:val="26"/>
+        </w:rPr>
+      </w:r>
+      <w:proofErr w:type="gramEnd"/>
+      <w:r>
+        <w:rPr>
+          <w:szCs w:val="26"/>
+        </w:rPr>
       </w:r>
     </w:p>
     <w:p>
@@ -16755,21 +16866,110 @@
         <w:rPr>
           <w:szCs w:val="26"/>
         </w:rPr>
-        <w:t xml:space="preserve">Luồng nghiệp vụ: User yêu cầu quên mật khẩu → tạo bản ghi OTP (vô hiệu hóa OTP cũ chưa dùng) → xác thực OTP → đặt mật khẩu mới → cập nhật </w:t>
+        <w:t>Luồng nghiệp vụ: User yêu cầu quên mật khẩu → tạo bản ghi OTP (vô hiệu hóa OTP cũ chưa dùng) → xác thực OTP → đặt mật khẩu mới → cập nhật users.password_hash và đánh dấu consumed_at. Gửi email SMTP có thể bổ sung; UI được phép hiển thị mã demo khi chưa cấu hình SMTP.</w:t>
       </w:r>
-      <w:proofErr w:type="gramStart"/>
+    </w:p>
+    <w:p>
+      <w:pPr>
+        <w:spacing w:after="80"/>
+        <w:rPr>
+          <w:color w:val="000000" w:themeColor="text1"/>
+          <w:szCs w:val="26"/>
+        </w:rPr>
+      </w:pPr>
+      <w:r>
+        <w:t>4.14. Dữ liệu phục vụ Trợ lý AI (không phải bảng bắt buộc)</w:t>
+      </w:r>
+    </w:p>
+    <w:p>
+      <w:pPr>
+        <w:spacing w:after="80"/>
+        <w:rPr>
+          <w:color w:val="000000" w:themeColor="text1"/>
+          <w:szCs w:val="26"/>
+        </w:rPr>
+      </w:pPr>
+      <w:r>
+        <w:t>Mục đích: Làm rõ cách module AI sử dụng CSDL hiện có mà không mở rộng schema bắt buộc.</w:t>
+      </w:r>
+    </w:p>
+    <w:p>
+      <w:pPr>
+        <w:pStyle w:val="ListBullet"/>
+        <w:spacing w:after="80"/>
+        <w:rPr>
+          <w:color w:val="000000" w:themeColor="text1"/>
+          <w:szCs w:val="26"/>
+        </w:rPr>
+      </w:pPr>
+      <w:r>
+        <w:t>Nguồn dữ liệu grounding: gyms (id, name, slug, district, price_min/max, avg_rating, status), trainers (id, name, slug, specialty, price, experience, avg_rating, status), kèm districts, categories, specialties, amenities để lọc và mô tả ngữ cảnh cho LLM.</w:t>
+      </w:r>
+    </w:p>
+    <w:p>
+      <w:pPr>
+        <w:pStyle w:val="ListBullet"/>
+        <w:spacing w:after="80"/>
+        <w:rPr>
+          <w:color w:val="000000" w:themeColor="text1"/>
+          <w:szCs w:val="26"/>
+        </w:rPr>
+      </w:pPr>
+      <w:r>
+        <w:t>Ràng buộc nghiệp vụ khi đọc: chỉ đưa vào catalog các bản ghi status='active' (đã áp dụng cơ chế soft-hide). Không lộ dữ liệu ẩn/khóa cho Guest/User qua AI.</w:t>
+      </w:r>
+    </w:p>
+    <w:p>
+      <w:pPr>
+        <w:pStyle w:val="ListBullet"/>
+        <w:spacing w:after="80"/>
+        <w:rPr>
+          <w:color w:val="000000" w:themeColor="text1"/>
+          <w:szCs w:val="26"/>
+        </w:rPr>
+      </w:pPr>
+      <w:r>
+        <w:t>Lưu trữ hội thoại: PHP session (tối đa 12 lượt hỏi–đáp); không ghi bảng reviews/favorites. API rate-limit theo session/IP ở tầng ứng dụng.</w:t>
+      </w:r>
+    </w:p>
+    <w:p>
+      <w:pPr>
+        <w:pStyle w:val="ListBullet"/>
+        <w:spacing w:after="80"/>
+        <w:rPr>
+          <w:color w:val="000000" w:themeColor="text1"/>
+          <w:szCs w:val="26"/>
+        </w:rPr>
+      </w:pPr>
+      <w:r>
+        <w:t>Hướng mở rộng schema (tuỳ chọn): ai_conversations(id, user_id NULL, created_at) và ai_messages(id, conversation_id, role, content, created_at) nếu cần lưu lịch sử đăng nhập.</w:t>
+      </w:r>
+    </w:p>
+    <w:p>
+      <w:pPr>
+        <w:spacing w:after="80"/>
+        <w:rPr>
+          <w:color w:val="000000" w:themeColor="text1"/>
+          <w:szCs w:val="26"/>
+        </w:rPr>
+      </w:pPr>
+    </w:p>
+    <w:p>
+      <w:pPr>
+        <w:keepNext/>
+        <w:spacing w:before="280" w:after="120"/>
+        <w:rPr>
+          <w:color w:val="000000" w:themeColor="text1"/>
+          <w:szCs w:val="26"/>
+        </w:rPr>
+      </w:pPr>
       <w:r>
         <w:rPr>
+          <w:b/>
           <w:szCs w:val="26"/>
         </w:rPr>
-        <w:t>users.password</w:t>
-      </w:r>
-      <w:proofErr w:type="gramEnd"/>
-      <w:r>
-        <w:rPr>
-          <w:szCs w:val="26"/>
-        </w:rPr>
-        <w:t>_hash và đánh dấu consumed_at. Gửi email SMTP có thể bổ sung; UI được phép hiển thị mã demo khi chưa cấu hình SMTP.</w:t>
+        <w:lastRenderedPageBreak/>
+        <w:t>5. Ràng buộc toàn vẹn &amp; Quy tắc nghiệp vụ (Integrity Constraints)</w:t>
       </w:r>
     </w:p>
     <w:p>

</xml_diff>